<commit_message>
Typ-Nummern in deutschen Bedienungsanleitungen ergänzt
Piezo Typ 0312, Keramik Typ 0420, Frequenz-/Pulszähler Typ 0330 und
Modbus-Konverter Typ 0210 wieder in Zubehörlisten, Abschnittsüberschriften
und Fließtext eingetragen (Aquatos mini DE + Aquatos Web LTX DE).
</commit_message>
<xml_diff>
--- a/Aquatos-mini/TerraTransfer_Aquatos-mini_Bedienungsanleitung_DE.docx
+++ b/Aquatos-mini/TerraTransfer_Aquatos-mini_Bedienungsanleitung_DE.docx
@@ -1561,7 +1561,7 @@
           <w:sz w:val="22"/>
           <w:szCs w:val="22"/>
         </w:rPr>
-        <w:t xml:space="preserve">Piezoresistiver Drucksensor, Relativdruck mit Kapillare (Standard, Edelstahl- oder Titan-Membran, 5 / 10 / 20 / 30 / 100 mWS)</w:t>
+        <w:t>Piezo-Drucksensor Typ 0312, piezoresistiver Relativdrucksensor mit Kapillare (Standard, Edelstahl- oder Titan-Membran, 5 / 10 / 20 / 30 / 100 mWS)</w:t>
       </w:r>
     </w:p>
     <w:p>
@@ -1580,7 +1580,7 @@
           <w:sz w:val="22"/>
           <w:szCs w:val="22"/>
         </w:rPr>
-        <w:t xml:space="preserve">Keramischer Drucksensor, Relativdruck mit Kapillare (0–1 bar, 10 m Kabel)</w:t>
+        <w:t>Keramik-Drucksensor Typ 0420, keramischer Relativdrucksensor mit Kapillare (0–1 bar, 10 m Kabel)</w:t>
       </w:r>
     </w:p>
     <w:p>
@@ -1599,7 +1599,7 @@
           <w:sz w:val="22"/>
           <w:szCs w:val="22"/>
         </w:rPr>
-        <w:t xml:space="preserve">Frequenz-/Pulszähler (Niederschlagsadapter oder Wasserzähler-Adapter)</w:t>
+        <w:t>Frequenz-/Pulszähler Typ 0330 (Niederschlagsadapter oder Wasserzähler-Adapter)</w:t>
       </w:r>
     </w:p>
     <w:p>
@@ -2912,7 +2912,7 @@
           <w:sz w:val="24"/>
           <w:szCs w:val="24"/>
         </w:rPr>
-        <w:t xml:space="preserve">Piezo-Drucksensor</w:t>
+        <w:t>Piezo-Drucksensor Typ 0312</w:t>
       </w:r>
     </w:p>
     <w:p>
@@ -3131,7 +3131,7 @@
           <w:sz w:val="24"/>
           <w:szCs w:val="24"/>
         </w:rPr>
-        <w:t xml:space="preserve">Keramik-Drucksensor</w:t>
+        <w:t>Keramik-Drucksensor Typ 0420</w:t>
       </w:r>
     </w:p>
     <w:p>
@@ -5308,7 +5308,7 @@
           <w:sz w:val="22"/>
           <w:szCs w:val="22"/>
         </w:rPr>
-        <w:t xml:space="preserve">Frequenz-/Pulszähler als Niederschlagsadapter (Kippwaage) oder Wasserzähler-Adapter.</w:t>
+        <w:t>Frequenz-/Pulszähler Typ 0330 als Niederschlagsadapter (Kippwaage) oder Wasserzähler-Adapter.</w:t>
       </w:r>
     </w:p>
     <w:p>
@@ -5346,7 +5346,7 @@
           <w:sz w:val="22"/>
           <w:szCs w:val="22"/>
         </w:rPr>
-        <w:t xml:space="preserve">Modbus-Konverter zur Anbindung von Modbus-RS485-Sensoren an den SDI-12-Bus.</w:t>
+        <w:t>Modbus-Konverter Typ 0210 zur Anbindung von Modbus-RS485-Sensoren an den SDI-12-Bus.</w:t>
       </w:r>
     </w:p>
     <w:p>

</xml_diff>